<commit_message>
chore(release): prepare v1.1.0 candidate
</commit_message>
<xml_diff>
--- a/Problems/P0054/paper/submission/jcta/P0054-JCTA-cover-letter.docx
+++ b/Problems/P0054/paper/submission/jcta/P0054-JCTA-cover-letter.docx
@@ -58,7 +58,7 @@
         <w:rPr>
           <w:rFonts w:ascii="Aptos" w:hAnsi="Aptos"/>
         </w:rPr>
-        <w:t>July 29, 2026</w:t>
+        <w:t>July 30, 2026</w:t>
       </w:r>
     </w:p>
     <w:p>
@@ -111,14 +111,13 @@
     </w:p>
     <w:p>
       <w:pPr>
-        <w:keepLines/>
         <w:jc w:val="both"/>
       </w:pPr>
       <w:r>
         <w:rPr>
           <w:rFonts w:ascii="Aptos" w:hAnsi="Aptos"/>
         </w:rPr>
-        <w:t>The article is intended for JCTA because its main contribution is an exact extremal result in set systems, with structural blocker arguments forming the mathematical core. The supporting artifacts include construction verifiers, exact-search programs, CNF instances, DRAT certificates, manifests, tests, and a Lean 4 formalization of both eventual equalities. The article is self-contained at the mathematical level; these artifacts provide separate reproducibility and formal-verification layers.</w:t>
+        <w:t>A separately submitted supplementary proof dossier records the arbitrary-finite blocker interfaces, one complete worked reduction, independent replay counts, and a theorem-proof-program-Lean crosswalk.</w:t>
       </w:r>
     </w:p>
     <w:p>
@@ -130,7 +129,19 @@
         <w:rPr>
           <w:rFonts w:ascii="Aptos" w:hAnsi="Aptos"/>
         </w:rPr>
-        <w:t>The manuscript is original, has not been published previously, and is not under consideration for publication elsewhere. The author declares no competing interests. This research received no specific grant from funding agencies in the public, commercial, or not-for-profit sectors. A versioned GitHub release and an immutable Zenodo archive are cited in the final submission package.</w:t>
+        <w:t>The article is intended for JCTA because its main contribution is an exact extremal result in set systems, with structural blocker arguments forming the mathematical core. The supporting artifacts include construction verifiers, exact-search programs, CNF instances, DRAT certificates, manifests, tests, and a Lean 4 formalization of both eventual equalities. The article states the mathematical architecture and exact trust boundary; for the largest finite classifications, the named Lean declarations are the primary proof objects, with the programs supplying independent reproducibility checks.</w:t>
+      </w:r>
+    </w:p>
+    <w:p>
+      <w:pPr>
+        <w:keepLines/>
+        <w:jc w:val="both"/>
+      </w:pPr>
+      <w:r>
+        <w:rPr>
+          <w:rFonts w:ascii="Aptos" w:hAnsi="Aptos"/>
+        </w:rPr>
+        <w:t>The manuscript is original, has not been published previously, and is not under consideration for publication elsewhere. The author declares no competing interests. This research received no specific grant from funding agencies in the public, commercial, or not-for-profit sectors. The final submission will cite a versioned GitHub release and an immutable Zenodo record that contain this exact revision.</w:t>
       </w:r>
     </w:p>
     <w:p>
@@ -547,8 +558,8 @@
       <w:spacing w:after="140" w:line="259" w:lineRule="auto"/>
     </w:pPr>
     <w:rPr>
-      <w:rFonts w:ascii="Arial" w:hAnsi="Arial" w:eastAsia="Arial"/>
-      <w:sz w:val="21"/>
+      <w:rFonts w:ascii="Times New Roman" w:hAnsi="Times New Roman" w:eastAsia="Arial"/>
+      <w:sz w:val="22"/>
     </w:rPr>
   </w:style>
   <w:style w:type="paragraph" w:styleId="Header">

</xml_diff>

<commit_message>
chore(release): finalize v1.1.0 publication metadata
</commit_message>
<xml_diff>
--- a/Problems/P0054/paper/submission/jcta/P0054-JCTA-cover-letter.docx
+++ b/Problems/P0054/paper/submission/jcta/P0054-JCTA-cover-letter.docx
@@ -58,7 +58,7 @@
         <w:rPr>
           <w:rFonts w:ascii="Aptos" w:hAnsi="Aptos"/>
         </w:rPr>
-        <w:t>July 30, 2026</w:t>
+        <w:t>August 1, 2026</w:t>
       </w:r>
     </w:p>
     <w:p>
@@ -141,7 +141,7 @@
         <w:rPr>
           <w:rFonts w:ascii="Aptos" w:hAnsi="Aptos"/>
         </w:rPr>
-        <w:t>The manuscript is original, has not been published previously, and is not under consideration for publication elsewhere. The author declares no competing interests. This research received no specific grant from funding agencies in the public, commercial, or not-for-profit sectors. The final submission will cite a versioned GitHub release and an immutable Zenodo record that contain this exact revision.</w:t>
+        <w:t>The manuscript is original, has not been published previously, and is not under consideration for publication elsewhere. The author declares no competing interests. This research received no specific grant from funding agencies in the public, commercial, or not-for-profit sectors. The final submission cites GitHub release v1.1.0 and Zenodo DOI 10.5281/zenodo.21730916, which contain this exact revision.</w:t>
       </w:r>
     </w:p>
     <w:p>

</xml_diff>

<commit_message>
release: prepare v1.1.2 exposition revision
</commit_message>
<xml_diff>
--- a/Problems/P0054/paper/submission/jcta/P0054-JCTA-cover-letter.docx
+++ b/Problems/P0054/paper/submission/jcta/P0054-JCTA-cover-letter.docx
@@ -55,10 +55,7 @@
         <w:keepLines/>
       </w:pPr>
       <w:r>
-        <w:rPr>
-          <w:rFonts w:ascii="Aptos" w:hAnsi="Aptos"/>
-        </w:rPr>
-        <w:t>August 1, 2026</w:t>
+        <w:t>August 3, 2026</w:t>
       </w:r>
     </w:p>
     <w:p>
@@ -114,10 +111,7 @@
         <w:jc w:val="both"/>
       </w:pPr>
       <w:r>
-        <w:rPr>
-          <w:rFonts w:ascii="Aptos" w:hAnsi="Aptos"/>
-        </w:rPr>
-        <w:t>A separately submitted supplementary proof dossier records the arbitrary-finite blocker interfaces, one complete worked reduction, independent replay counts, and a theorem-proof-program-Lean crosswalk.</w:t>
+        <w:t>A separately submitted supplement records the arbitrary-finite blocker interfaces, one complete worked reduction, independent replay counts, and a theorem-proof-program-Lean crosswalk.</w:t>
       </w:r>
     </w:p>
     <w:p>
@@ -138,10 +132,7 @@
         <w:jc w:val="both"/>
       </w:pPr>
       <w:r>
-        <w:rPr>
-          <w:rFonts w:ascii="Aptos" w:hAnsi="Aptos"/>
-        </w:rPr>
-        <w:t>The manuscript is original, has not been published previously, and is not under consideration for publication elsewhere. The author declares no competing interests. This research received no specific grant from funding agencies in the public, commercial, or not-for-profit sectors. The final submission cites GitHub release v1.1.1 and Zenodo DOI 10.5281/zenodo.21769438, which contain this exact revision.</w:t>
+        <w:t>The manuscript is original, has not been published previously, and is not under consideration for publication elsewhere. The author declares no competing interests. This research received no specific grant from funding agencies in the public, commercial, or not-for-profit sectors. The final submission cites GitHub release v1.1.2 and Zenodo DOI 10.5281/zenodo.21770438, which contain this exact revision.</w:t>
       </w:r>
     </w:p>
     <w:p>

</xml_diff>